<commit_message>
Too Many Crooks: lineup art style everywhere
Box top/side/end, crew sheets, sell sheet, game page skin, play UI and 3D
renders move from the manila case file to the slate police-lineup look.
Shared crooks.js draws the figures; role headers are crook mugshots.
New line: score with your rivals' dice, then decide who gets paid.
Rulebook header updated (3-6 players, no tagline); print-and-play rebuilt.

Co-Authored-By: Claude Opus 5.5 <noreply@anthropic.com>
Claude-Session: https://claude.ai/code/session_012qTdj8ixYTFm2SVZoY9dbq
</commit_message>
<xml_diff>
--- a/games/too-many-crooks/too-many-crooks-rules.docx
+++ b/games/too-many-crooks/too-many-crooks-rules.docx
@@ -43,7 +43,7 @@
           <w:sz w:val="24"/>
           <w:szCs w:val="24"/>
         </w:rPr>
-        <w:t xml:space="preserve">Three jobs. Everyone gets a cut. Almost.</w:t>
+        <w:t xml:space="preserve">Score with your rivals' dice, then decide who gets paid.</w:t>
       </w:r>
     </w:p>
     <w:p>
@@ -65,7 +65,7 @@
           <w:sz w:val="17"/>
           <w:szCs w:val="17"/>
         </w:rPr>
-        <w:t xml:space="preserve">4–6 players          20–30 minutes          Ages 12+</w:t>
+        <w:t xml:space="preserve">3–6 players          20–30 minutes</w:t>
       </w:r>
     </w:p>
     <w:p>

</xml_diff>

<commit_message>
Too Many Crooks: frozen-out hosts run the job with their own people
If nobody sends you anything, crew one of each kind from your own kept dice
by the usual crew rules and score it (doubled on job 3); no cuts, no extra
own cut. Engine, play UI, rulebook PDF, print-and-play and Word rules updated.

Co-Authored-By: Claude Opus 5.5 <noreply@anthropic.com>
Claude-Session: https://claude.ai/code/session_012qTdj8ixYTFm2SVZoY9dbq
</commit_message>
<xml_diff>
--- a/games/too-many-crooks/too-many-crooks-rules.docx
+++ b/games/too-many-crooks/too-many-crooks-rules.docx
@@ -1625,7 +1625,7 @@
           <w:sz w:val="19"/>
           <w:szCs w:val="19"/>
         </w:rPr>
-        <w:t xml:space="preserve">You score the total of your crew. If nobody sent you a die of some kind, that place stays empty and you run the job short.</w:t>
+        <w:t xml:space="preserve">You score the total of your crew. If any die of a kind was sent to you, you must fill that place. If nobody sent you a die of some kind, that place stays empty and you run the job short.</w:t>
       </w:r>
     </w:p>
     <w:p>
@@ -1731,6 +1731,27 @@
           <w:sz w:val="19"/>
           <w:szCs w:val="19"/>
         </w:rPr>
+        <w:t xml:space="preserve">Cuts only go to crew on your job. If your crew is short, hand out the same number of dice anyway, stacked on the crew you have.</w:t>
+      </w:r>
+    </w:p>
+    <w:p>
+      <w:pPr>
+        <w:keepNext w:val="false"/>
+        <w:spacing w:after="110" w:before="0" w:line="265"/>
+        <w:jc w:val="left"/>
+      </w:pPr>
+      <w:r>
+        <w:rPr>
+          <w:rFonts w:ascii="Barlow" w:cs="Barlow" w:eastAsia="Barlow" w:hAnsi="Barlow"/>
+          <w:b w:val="false"/>
+          <w:bCs w:val="false"/>
+          <w:i w:val="false"/>
+          <w:iCs w:val="false"/>
+          <w:caps w:val="false"/>
+          <w:color w:val="12171A"/>
+          <w:sz w:val="19"/>
+          <w:szCs w:val="19"/>
+        </w:rPr>
         <w:t xml:space="preserve">Whoever receives a cut scores the total of the dice handed to them.</w:t>
       </w:r>
     </w:p>
@@ -1838,7 +1859,7 @@
           <w:sz w:val="19"/>
           <w:szCs w:val="19"/>
         </w:rPr>
-        <w:t xml:space="preserve">If nobody sent you anything, take one of your own kept dice as your crew and score it. You cut no one in.</w:t>
+        <w:t xml:space="preserve">If nobody sent you anything, run the job with your own people: from your kept dice, take one of each kind by the usual crew rules and score them as your crew (doubled on the last job). You cut no one in, and you keep no separate cut.</w:t>
       </w:r>
     </w:p>
     <w:p>
@@ -1859,7 +1880,7 @@
           <w:sz w:val="19"/>
           <w:szCs w:val="19"/>
         </w:rPr>
-        <w:t xml:space="preserve">Sending a single die to a job that would otherwise be empty prevents this — though it will then be crewed, and may be cut in.</w:t>
+        <w:t xml:space="preserve">On the first two jobs, still put one of your dice back in the box afterward. Being frozen out hurts, but it does not knock you out.</w:t>
       </w:r>
     </w:p>
     <w:p>
@@ -2338,7 +2359,7 @@
           <w:sz w:val="19"/>
           <w:szCs w:val="19"/>
         </w:rPr>
-        <w:t xml:space="preserve">You can freeze someone out. Nothing obliges you to send a rival anything. A job nobody supplies is worth almost nothing — and whoever breaks ranks to supply it can name their price.</w:t>
+        <w:t xml:space="preserve">You can freeze someone out, for a while. Nothing obliges you to send a rival anything. A frozen job runs on its host's own dice and is worth about half — and whoever breaks ranks to supply it can name their price.</w:t>
       </w:r>
     </w:p>
     <w:p>

</xml_diff>

<commit_message>
Too Many Crooks: frozen-out hosts still take their own cut; short crews pay as normal
Frozen hosts crew from their own kept dice (doubled on job 3) and, on jobs 1-2,
score their best leftover kept die as their cut. Short crews hand out the full
number of cuts, stacked; own dice never fill an empty slot.

Co-Authored-By: Claude Opus 5.5 <noreply@anthropic.com>
Claude-Session: https://claude.ai/code/session_012qTdj8ixYTFm2SVZoY9dbq
</commit_message>
<xml_diff>
--- a/games/too-many-crooks/too-many-crooks-rules.docx
+++ b/games/too-many-crooks/too-many-crooks-rules.docx
@@ -1731,7 +1731,7 @@
           <w:sz w:val="19"/>
           <w:szCs w:val="19"/>
         </w:rPr>
-        <w:t xml:space="preserve">Cuts only go to crew on your job. If your crew is short, hand out the same number of dice anyway, stacked on the crew you have.</w:t>
+        <w:t xml:space="preserve">Cuts only go to crew on your job. If your crew is short, pay and place your cuts as normal: hand out the same number of dice, stacked on the crew you have. Never fill an empty place with one of your own dice.</w:t>
       </w:r>
     </w:p>
     <w:p>
@@ -1859,7 +1859,7 @@
           <w:sz w:val="19"/>
           <w:szCs w:val="19"/>
         </w:rPr>
-        <w:t xml:space="preserve">If nobody sent you anything, run the job with your own people: from your kept dice, take one of each kind by the usual crew rules and score them as your crew (doubled on the last job). You cut no one in, and you keep no separate cut.</w:t>
+        <w:t xml:space="preserve">If nobody sent you anything, run the job with your own people: from your kept dice, take one of each kind by the usual crew rules and score them as your crew (doubled on the last job). You cut no one in. On the first two jobs you still take your own cut: score your best leftover kept die and put it back in the box.</w:t>
       </w:r>
     </w:p>
     <w:p>
@@ -1880,7 +1880,7 @@
           <w:sz w:val="19"/>
           <w:szCs w:val="19"/>
         </w:rPr>
-        <w:t xml:space="preserve">On the first two jobs, still put one of your dice back in the box afterward. Being frozen out hurts, but it does not knock you out.</w:t>
+        <w:t xml:space="preserve">If your crew used every kept die, you have no cut that job; put one of your dice back in the box anyway. Being frozen out hurts, but it does not knock you out.</w:t>
       </w:r>
     </w:p>
     <w:p>
@@ -2359,7 +2359,7 @@
           <w:sz w:val="19"/>
           <w:szCs w:val="19"/>
         </w:rPr>
-        <w:t xml:space="preserve">You can freeze someone out, for a while. Nothing obliges you to send a rival anything. A frozen job runs on its host's own dice and is worth about half — and whoever breaks ranks to supply it can name their price.</w:t>
+        <w:t xml:space="preserve">You can freeze someone out, for a while. Nothing obliges you to send a rival anything. A frozen job runs on its host's own dice and is worth about three-quarters — and whoever breaks ranks to supply it can name their price.</w:t>
       </w:r>
     </w:p>
     <w:p>

</xml_diff>